<commit_message>
fix: caratula con errores modificada
</commit_message>
<xml_diff>
--- a/docs/V2/Estándar de Cifrado Avanzado.docx
+++ b/docs/V2/Estándar de Cifrado Avanzado.docx
@@ -5,8 +5,8 @@
     <w:p>
       <w:bookmarkStart w:id="0" w:name="Xe823b902bcf20c095265ab6efdff077c8e415ac"/>
       <w:r>
-        <w:pict w14:anchorId="29783A82">
-          <v:rect id="_x0000_i1025" style="width:0;height:1.5pt" o:hralign="center" o:hrstd="t" o:hr="t"/>
+        <w:pict w14:anchorId="5415DACD">
+          <v:rect id="_x0000_i1033" style="width:0;height:1.5pt" o:hralign="center" o:hrstd="t" o:hr="t"/>
         </w:pict>
       </w:r>
     </w:p>
@@ -22,8 +22,21 @@
           <w:lang w:val="es-AR" w:eastAsia="en-US"/>
         </w:rPr>
       </w:pPr>
-      <w:bookmarkStart w:id="1" w:name="carátula"/>
-      <w:r>
+      <w:r>
+        <w:rPr>
+          <w:rFonts w:eastAsiaTheme="minorHAnsi" w:cs="Times New Roman"/>
+          <w:b/>
+          <w:sz w:val="40"/>
+          <w:szCs w:val="48"/>
+          <w:lang w:val="es-AR" w:eastAsia="en-US"/>
+        </w:rPr>
+        <w:t xml:space="preserve">ESTÁNDAR DE CIFRADO AVANZADO (AES): IMPLEMENTACIÓN Y ANÁLISIS ADVANCED </w:t>
+      </w:r>
+    </w:p>
+    <w:p>
+      <w:pPr>
+        <w:spacing w:after="0" w:line="360" w:lineRule="auto"/>
+        <w:jc w:val="center"/>
         <w:rPr>
           <w:rFonts w:eastAsiaTheme="minorHAnsi" w:cs="Times New Roman"/>
           <w:b/>
@@ -31,20 +44,6 @@
           <w:szCs w:val="48"/>
           <w:lang w:val="es-AR" w:eastAsia="en-US"/>
         </w:rPr>
-        <w:t xml:space="preserve">ESTÁNDAR DE CIFRADO AVANZADO (AES): IMPLEMENTACIÓN Y ANÁLISIS ADVANCED </w:t>
-      </w:r>
-    </w:p>
-    <w:p>
-      <w:pPr>
-        <w:spacing w:after="0" w:line="360" w:lineRule="auto"/>
-        <w:jc w:val="center"/>
-        <w:rPr>
-          <w:rFonts w:eastAsiaTheme="minorHAnsi" w:cs="Times New Roman"/>
-          <w:b/>
-          <w:sz w:val="48"/>
-          <w:szCs w:val="48"/>
-          <w:lang w:val="es-AR" w:eastAsia="en-US"/>
-        </w:rPr>
       </w:pPr>
     </w:p>
     <w:p>
@@ -63,7 +62,7 @@
         <w:rPr>
           <w:rFonts w:eastAsiaTheme="minorHAnsi" w:cs="Times New Roman"/>
           <w:b/>
-          <w:sz w:val="48"/>
+          <w:sz w:val="40"/>
           <w:szCs w:val="48"/>
           <w:lang w:eastAsia="en-US"/>
         </w:rPr>
@@ -79,711 +78,613 @@
         </w:rPr>
       </w:pPr>
     </w:p>
-    <w:p>
-      <w:pPr>
-        <w:pStyle w:val="Textoindependiente"/>
-        <w:jc w:val="right"/>
-        <w:rPr>
-          <w:sz w:val="24"/>
-          <w:lang w:val="es-AR"/>
-        </w:rPr>
-      </w:pPr>
-      <w:r>
-        <w:rPr>
-          <w:b/>
-          <w:bCs/>
-          <w:sz w:val="24"/>
-          <w:lang w:val="es-AR"/>
-        </w:rPr>
-        <w:t>Integrantes:</w:t>
-      </w:r>
-    </w:p>
-    <w:p>
-      <w:pPr>
-        <w:pStyle w:val="Textoindependiente"/>
-        <w:jc w:val="right"/>
-        <w:rPr>
-          <w:lang w:val="es-AR"/>
-        </w:rPr>
-      </w:pPr>
-      <w:r>
-        <w:rPr>
-          <w:lang w:val="es-AR"/>
-        </w:rPr>
-        <w:t>Nicolás Agustín Marco</w:t>
-      </w:r>
-    </w:p>
-    <w:p>
-      <w:pPr>
-        <w:pStyle w:val="Textoindependiente"/>
-        <w:jc w:val="right"/>
-        <w:rPr>
-          <w:rFonts w:eastAsiaTheme="minorHAnsi" w:cs="Times New Roman"/>
-          <w:sz w:val="18"/>
-          <w:szCs w:val="18"/>
-          <w:lang w:val="es-AR" w:eastAsia="en-US"/>
-        </w:rPr>
-      </w:pPr>
-      <w:r>
-        <w:rPr>
-          <w:rFonts w:eastAsiaTheme="minorHAnsi" w:cs="Times New Roman"/>
-          <w:sz w:val="18"/>
-          <w:szCs w:val="18"/>
-          <w:lang w:val="es-AR" w:eastAsia="en-US"/>
-        </w:rPr>
-        <w:t>Ingeniería en Informática, Universidad Nacional de La Matanza</w:t>
-      </w:r>
-    </w:p>
-    <w:p>
-      <w:pPr>
-        <w:pStyle w:val="Textoindependiente"/>
-        <w:jc w:val="right"/>
-        <w:rPr>
-          <w:rFonts w:ascii="Courier" w:eastAsiaTheme="minorHAnsi" w:hAnsi="Courier" w:cs="Times New Roman"/>
-          <w:sz w:val="18"/>
-          <w:szCs w:val="18"/>
-          <w:lang w:val="es-AR" w:eastAsia="en-US"/>
-        </w:rPr>
-      </w:pPr>
-      <w:r>
-        <w:rPr>
-          <w:rFonts w:ascii="Courier" w:eastAsiaTheme="minorHAnsi" w:hAnsi="Courier" w:cs="Times New Roman"/>
-          <w:sz w:val="18"/>
-          <w:szCs w:val="18"/>
-          <w:lang w:val="es-AR" w:eastAsia="en-US"/>
-        </w:rPr>
-        <w:t>nmarco@alumno.unlam.edu.ar</w:t>
-      </w:r>
-    </w:p>
-    <w:p>
-      <w:pPr>
-        <w:pStyle w:val="Textoindependiente"/>
-        <w:jc w:val="right"/>
-        <w:rPr>
-          <w:lang w:val="es-AR"/>
-        </w:rPr>
-      </w:pPr>
-      <w:r>
-        <w:rPr>
-          <w:lang w:val="es-AR"/>
-        </w:rPr>
-        <w:t xml:space="preserve"> Iván</w:t>
-      </w:r>
-      <w:r>
-        <w:rPr>
-          <w:lang w:val="es-AR"/>
-        </w:rPr>
-        <w:t xml:space="preserve"> </w:t>
-      </w:r>
-      <w:proofErr w:type="spellStart"/>
-      <w:r>
-        <w:rPr>
-          <w:lang w:val="es-AR"/>
-        </w:rPr>
-        <w:t>Fabrizio</w:t>
-      </w:r>
-      <w:proofErr w:type="spellEnd"/>
-      <w:r>
-        <w:rPr>
-          <w:lang w:val="es-AR"/>
-        </w:rPr>
-        <w:t xml:space="preserve"> </w:t>
-      </w:r>
-      <w:proofErr w:type="spellStart"/>
-      <w:r>
-        <w:rPr>
-          <w:lang w:val="es-AR"/>
-        </w:rPr>
-        <w:t>Abaca</w:t>
-      </w:r>
-      <w:proofErr w:type="spellEnd"/>
-    </w:p>
-    <w:p>
-      <w:pPr>
-        <w:pStyle w:val="Textoindependiente"/>
-        <w:jc w:val="right"/>
-        <w:rPr>
-          <w:rFonts w:eastAsiaTheme="minorHAnsi" w:cs="Times New Roman"/>
-          <w:sz w:val="18"/>
-          <w:szCs w:val="18"/>
-          <w:lang w:val="es-AR" w:eastAsia="en-US"/>
-        </w:rPr>
-      </w:pPr>
-      <w:r>
-        <w:rPr>
-          <w:rFonts w:eastAsiaTheme="minorHAnsi" w:cs="Times New Roman"/>
-          <w:sz w:val="18"/>
-          <w:szCs w:val="18"/>
-          <w:lang w:val="es-AR" w:eastAsia="en-US"/>
-        </w:rPr>
-        <w:t>Ingeniería en Informática, Universidad Nacional de La Matanza</w:t>
-      </w:r>
-    </w:p>
-    <w:p>
-      <w:pPr>
-        <w:pStyle w:val="Textoindependiente"/>
-        <w:jc w:val="right"/>
-        <w:rPr>
-          <w:rFonts w:ascii="Courier" w:eastAsiaTheme="minorHAnsi" w:hAnsi="Courier" w:cs="Times New Roman"/>
-          <w:sz w:val="18"/>
-          <w:szCs w:val="18"/>
-          <w:lang w:val="es-AR" w:eastAsia="en-US"/>
-        </w:rPr>
-      </w:pPr>
-      <w:r>
-        <w:rPr>
-          <w:rFonts w:ascii="Courier" w:eastAsiaTheme="minorHAnsi" w:hAnsi="Courier" w:cs="Times New Roman"/>
-          <w:sz w:val="18"/>
-          <w:szCs w:val="18"/>
-          <w:lang w:val="es-AR" w:eastAsia="en-US"/>
-        </w:rPr>
-        <w:t>iabaca@alumno.unlam.edu.ar</w:t>
-      </w:r>
-    </w:p>
-    <w:p>
-      <w:pPr>
-        <w:pStyle w:val="Textoindependiente"/>
-        <w:jc w:val="right"/>
-        <w:rPr>
-          <w:lang w:val="es-AR"/>
-        </w:rPr>
-      </w:pPr>
-      <w:r>
-        <w:rPr>
-          <w:lang w:val="es-AR"/>
-        </w:rPr>
-        <w:t xml:space="preserve">Florencia </w:t>
-      </w:r>
-      <w:r>
-        <w:rPr>
-          <w:lang w:val="es-AR"/>
-        </w:rPr>
-        <w:t xml:space="preserve">Berenice </w:t>
-      </w:r>
-      <w:r>
-        <w:rPr>
-          <w:lang w:val="es-AR"/>
-        </w:rPr>
-        <w:t>Licarzi</w:t>
-      </w:r>
-    </w:p>
-    <w:p>
-      <w:pPr>
-        <w:pStyle w:val="Textoindependiente"/>
-        <w:jc w:val="right"/>
-        <w:rPr>
-          <w:rFonts w:eastAsiaTheme="minorHAnsi" w:cs="Times New Roman"/>
-          <w:sz w:val="18"/>
-          <w:szCs w:val="18"/>
-          <w:lang w:val="es-AR" w:eastAsia="en-US"/>
-        </w:rPr>
-      </w:pPr>
-      <w:r>
-        <w:rPr>
-          <w:rFonts w:eastAsiaTheme="minorHAnsi" w:cs="Times New Roman"/>
-          <w:sz w:val="18"/>
-          <w:szCs w:val="18"/>
-          <w:lang w:val="es-AR" w:eastAsia="en-US"/>
-        </w:rPr>
-        <w:t>Ingeniería en Informática, Universidad Nacional de La Matanza</w:t>
-      </w:r>
-    </w:p>
-    <w:p>
-      <w:pPr>
-        <w:pStyle w:val="Textoindependiente"/>
-        <w:jc w:val="right"/>
-        <w:rPr>
-          <w:rFonts w:ascii="Courier" w:eastAsiaTheme="minorHAnsi" w:hAnsi="Courier" w:cs="Times New Roman"/>
-          <w:sz w:val="18"/>
-          <w:szCs w:val="18"/>
-          <w:lang w:val="es-AR" w:eastAsia="en-US"/>
-        </w:rPr>
-      </w:pPr>
-      <w:r>
-        <w:rPr>
-          <w:rFonts w:ascii="Courier" w:eastAsiaTheme="minorHAnsi" w:hAnsi="Courier" w:cs="Times New Roman"/>
-          <w:sz w:val="18"/>
-          <w:szCs w:val="18"/>
-          <w:lang w:val="es-AR" w:eastAsia="en-US"/>
-        </w:rPr>
-        <w:t>flicarzi@alumno.unlam.edu.ar</w:t>
-      </w:r>
-    </w:p>
-    <w:p>
-      <w:pPr>
-        <w:pStyle w:val="Textoindependiente"/>
-        <w:jc w:val="right"/>
-        <w:rPr>
-          <w:lang w:val="es-AR"/>
-        </w:rPr>
-      </w:pPr>
-      <w:r>
-        <w:rPr>
-          <w:lang w:val="es-AR"/>
-        </w:rPr>
-        <w:t>Luca</w:t>
-      </w:r>
-      <w:r>
-        <w:rPr>
-          <w:lang w:val="es-AR"/>
-        </w:rPr>
-        <w:t xml:space="preserve"> </w:t>
-      </w:r>
-      <w:proofErr w:type="spellStart"/>
-      <w:r>
-        <w:rPr>
-          <w:lang w:val="es-AR"/>
-        </w:rPr>
-        <w:t>Sebastian</w:t>
-      </w:r>
-      <w:proofErr w:type="spellEnd"/>
-      <w:r>
-        <w:rPr>
-          <w:lang w:val="es-AR"/>
-        </w:rPr>
-        <w:t xml:space="preserve"> </w:t>
-      </w:r>
-      <w:proofErr w:type="spellStart"/>
-      <w:r>
-        <w:rPr>
-          <w:lang w:val="es-AR"/>
-        </w:rPr>
-        <w:t>Gonzalez</w:t>
-      </w:r>
-      <w:proofErr w:type="spellEnd"/>
-    </w:p>
-    <w:p>
-      <w:pPr>
-        <w:pStyle w:val="Textoindependiente"/>
-        <w:jc w:val="right"/>
-        <w:rPr>
-          <w:rFonts w:eastAsiaTheme="minorHAnsi" w:cs="Times New Roman"/>
-          <w:sz w:val="18"/>
-          <w:szCs w:val="18"/>
-          <w:lang w:val="es-AR" w:eastAsia="en-US"/>
-        </w:rPr>
-      </w:pPr>
-      <w:r>
-        <w:rPr>
-          <w:rFonts w:eastAsiaTheme="minorHAnsi" w:cs="Times New Roman"/>
-          <w:sz w:val="18"/>
-          <w:szCs w:val="18"/>
-          <w:lang w:val="es-AR" w:eastAsia="en-US"/>
-        </w:rPr>
-        <w:t>Ingeniería en Informática, Universidad Nacional de La Matanza</w:t>
-      </w:r>
-    </w:p>
-    <w:p>
-      <w:pPr>
-        <w:pStyle w:val="Textoindependiente"/>
-        <w:jc w:val="right"/>
-        <w:rPr>
-          <w:rFonts w:ascii="Courier" w:eastAsiaTheme="minorHAnsi" w:hAnsi="Courier" w:cs="Times New Roman"/>
-          <w:sz w:val="18"/>
-          <w:szCs w:val="18"/>
-          <w:lang w:eastAsia="en-US"/>
-        </w:rPr>
-      </w:pPr>
-      <w:r>
-        <w:rPr>
-          <w:rFonts w:ascii="Courier" w:eastAsiaTheme="minorHAnsi" w:hAnsi="Courier" w:cs="Times New Roman"/>
-          <w:sz w:val="18"/>
-          <w:szCs w:val="18"/>
-          <w:lang w:eastAsia="en-US"/>
-        </w:rPr>
-        <w:t>lucasebgonzalez@alumno.unlam.edu.ar</w:t>
-      </w:r>
-    </w:p>
-    <w:p>
-      <w:pPr>
-        <w:pStyle w:val="Textoindependiente"/>
-        <w:jc w:val="right"/>
-      </w:pPr>
-      <w:r>
-        <w:t xml:space="preserve">Augusto </w:t>
-      </w:r>
-      <w:r>
-        <w:t xml:space="preserve">Martin </w:t>
-      </w:r>
-      <w:proofErr w:type="spellStart"/>
-      <w:r>
-        <w:t>Coronati</w:t>
-      </w:r>
-      <w:proofErr w:type="spellEnd"/>
-    </w:p>
-    <w:p>
-      <w:pPr>
-        <w:pStyle w:val="Textoindependiente"/>
-        <w:jc w:val="right"/>
-        <w:rPr>
-          <w:rFonts w:eastAsiaTheme="minorHAnsi" w:cs="Times New Roman"/>
-          <w:sz w:val="18"/>
-          <w:szCs w:val="18"/>
-          <w:lang w:val="es-AR" w:eastAsia="en-US"/>
-        </w:rPr>
-      </w:pPr>
-      <w:r>
-        <w:rPr>
-          <w:rFonts w:eastAsiaTheme="minorHAnsi" w:cs="Times New Roman"/>
-          <w:sz w:val="18"/>
-          <w:szCs w:val="18"/>
-          <w:lang w:val="es-AR" w:eastAsia="en-US"/>
-        </w:rPr>
-        <w:t>Ingeniería en Informática, Universidad Nacional de La Matanza</w:t>
-      </w:r>
-    </w:p>
-    <w:p>
-      <w:pPr>
-        <w:pStyle w:val="Textoindependiente"/>
-        <w:jc w:val="right"/>
-        <w:rPr>
-          <w:rFonts w:ascii="Courier" w:eastAsiaTheme="minorHAnsi" w:hAnsi="Courier" w:cs="Times New Roman"/>
-          <w:sz w:val="18"/>
-          <w:szCs w:val="18"/>
-          <w:lang w:val="es-AR" w:eastAsia="en-US"/>
-        </w:rPr>
-      </w:pPr>
-      <w:r>
-        <w:rPr>
-          <w:rFonts w:ascii="Courier" w:eastAsiaTheme="minorHAnsi" w:hAnsi="Courier" w:cs="Times New Roman"/>
-          <w:sz w:val="18"/>
-          <w:szCs w:val="18"/>
-          <w:lang w:val="es-AR" w:eastAsia="en-US"/>
-        </w:rPr>
-        <w:t>acoronati@alumno.unlam.edu.ar</w:t>
-      </w:r>
-    </w:p>
-    <w:p>
-      <w:pPr>
-        <w:pStyle w:val="Textoindependiente"/>
-        <w:jc w:val="right"/>
-        <w:rPr>
-          <w:lang w:val="es-AR"/>
-        </w:rPr>
-      </w:pPr>
-      <w:r>
-        <w:rPr>
-          <w:lang w:val="es-AR"/>
-        </w:rPr>
-        <w:t>Franco Caccavari</w:t>
-      </w:r>
-    </w:p>
-    <w:p>
-      <w:pPr>
-        <w:pStyle w:val="Textoindependiente"/>
-        <w:jc w:val="right"/>
-        <w:rPr>
-          <w:rFonts w:eastAsiaTheme="minorHAnsi" w:cs="Times New Roman"/>
-          <w:sz w:val="18"/>
-          <w:szCs w:val="18"/>
-          <w:lang w:val="es-AR" w:eastAsia="en-US"/>
-        </w:rPr>
-      </w:pPr>
-      <w:r>
-        <w:rPr>
-          <w:rFonts w:eastAsiaTheme="minorHAnsi" w:cs="Times New Roman"/>
-          <w:sz w:val="18"/>
-          <w:szCs w:val="18"/>
-          <w:lang w:val="es-AR" w:eastAsia="en-US"/>
-        </w:rPr>
-        <w:lastRenderedPageBreak/>
-        <w:t>Ingeniería en Informática, Universidad Nacional de La Matanza</w:t>
-      </w:r>
-    </w:p>
-    <w:p>
-      <w:pPr>
-        <w:pStyle w:val="Textoindependiente"/>
-        <w:jc w:val="right"/>
-        <w:rPr>
-          <w:rFonts w:ascii="Courier" w:eastAsiaTheme="minorHAnsi" w:hAnsi="Courier" w:cs="Times New Roman"/>
-          <w:sz w:val="18"/>
-          <w:szCs w:val="18"/>
-          <w:lang w:val="es-AR" w:eastAsia="en-US"/>
-        </w:rPr>
-      </w:pPr>
-      <w:r>
-        <w:rPr>
-          <w:rFonts w:ascii="Courier" w:eastAsiaTheme="minorHAnsi" w:hAnsi="Courier" w:cs="Times New Roman"/>
-          <w:sz w:val="18"/>
-          <w:szCs w:val="18"/>
-          <w:lang w:val="es-AR" w:eastAsia="en-US"/>
-        </w:rPr>
-        <w:t>fcaccavari064@alumno.unlam.edu.ar</w:t>
-      </w:r>
-    </w:p>
-    <w:p>
-      <w:pPr>
-        <w:pStyle w:val="Textoindependiente"/>
-        <w:jc w:val="right"/>
-        <w:rPr>
-          <w:lang w:val="es-AR"/>
-        </w:rPr>
-      </w:pPr>
-      <w:r>
-        <w:rPr>
-          <w:lang w:val="es-AR"/>
-        </w:rPr>
-        <w:t xml:space="preserve">Lautaro </w:t>
-      </w:r>
-      <w:r>
-        <w:rPr>
-          <w:lang w:val="es-AR"/>
-        </w:rPr>
-        <w:t xml:space="preserve">Leonardo Nicolas </w:t>
-      </w:r>
-      <w:r>
-        <w:rPr>
-          <w:lang w:val="es-AR"/>
-        </w:rPr>
-        <w:t>Schiaffino</w:t>
-      </w:r>
-    </w:p>
-    <w:p>
-      <w:pPr>
-        <w:pStyle w:val="Textoindependiente"/>
-        <w:jc w:val="right"/>
-        <w:rPr>
-          <w:rFonts w:eastAsiaTheme="minorHAnsi" w:cs="Times New Roman"/>
-          <w:sz w:val="18"/>
-          <w:szCs w:val="18"/>
-          <w:lang w:val="es-AR" w:eastAsia="en-US"/>
-        </w:rPr>
-      </w:pPr>
-      <w:r>
-        <w:rPr>
-          <w:rFonts w:eastAsiaTheme="minorHAnsi" w:cs="Times New Roman"/>
-          <w:sz w:val="18"/>
-          <w:szCs w:val="18"/>
-          <w:lang w:val="es-AR" w:eastAsia="en-US"/>
-        </w:rPr>
-        <w:t>Ingeniería en Informática, Universidad Nacional de La Matanza</w:t>
-      </w:r>
-    </w:p>
-    <w:p>
-      <w:pPr>
-        <w:pStyle w:val="Textoindependiente"/>
-        <w:jc w:val="right"/>
-        <w:rPr>
-          <w:rFonts w:ascii="Courier" w:eastAsiaTheme="minorHAnsi" w:hAnsi="Courier" w:cs="Times New Roman"/>
-          <w:sz w:val="18"/>
-          <w:szCs w:val="18"/>
-          <w:lang w:val="es-AR" w:eastAsia="en-US"/>
-        </w:rPr>
-      </w:pPr>
-      <w:r>
-        <w:rPr>
-          <w:rFonts w:ascii="Courier" w:eastAsiaTheme="minorHAnsi" w:hAnsi="Courier" w:cs="Times New Roman"/>
-          <w:sz w:val="18"/>
-          <w:szCs w:val="18"/>
-          <w:lang w:val="es-AR" w:eastAsia="en-US"/>
-        </w:rPr>
-        <w:t>laschiaffino@alumno.unlam.edu.ar</w:t>
-      </w:r>
-    </w:p>
-    <w:p>
-      <w:pPr>
-        <w:pStyle w:val="Textoindependiente"/>
-        <w:jc w:val="right"/>
-        <w:rPr>
-          <w:lang w:val="es-AR"/>
-        </w:rPr>
-      </w:pPr>
-      <w:r>
-        <w:rPr>
-          <w:lang w:val="es-AR"/>
-        </w:rPr>
-        <w:t xml:space="preserve">Federico </w:t>
-      </w:r>
-      <w:r>
-        <w:rPr>
-          <w:lang w:val="es-AR"/>
-        </w:rPr>
-        <w:t xml:space="preserve">Gabriel </w:t>
-      </w:r>
-      <w:r>
-        <w:rPr>
-          <w:lang w:val="es-AR"/>
-        </w:rPr>
-        <w:t>Castro</w:t>
-      </w:r>
-    </w:p>
-    <w:p>
-      <w:pPr>
-        <w:pStyle w:val="Textoindependiente"/>
-        <w:jc w:val="right"/>
-        <w:rPr>
-          <w:rFonts w:eastAsiaTheme="minorHAnsi" w:cs="Times New Roman"/>
-          <w:sz w:val="18"/>
-          <w:szCs w:val="18"/>
-          <w:lang w:val="es-AR" w:eastAsia="en-US"/>
-        </w:rPr>
-      </w:pPr>
-      <w:r>
-        <w:rPr>
-          <w:rFonts w:eastAsiaTheme="minorHAnsi" w:cs="Times New Roman"/>
-          <w:sz w:val="18"/>
-          <w:szCs w:val="18"/>
-          <w:lang w:val="es-AR" w:eastAsia="en-US"/>
-        </w:rPr>
-        <w:t>Ingeniería en Informática, Universidad Nacional de La Matanza</w:t>
-      </w:r>
-    </w:p>
-    <w:p>
-      <w:pPr>
-        <w:pStyle w:val="Textoindependiente"/>
-        <w:jc w:val="right"/>
-        <w:rPr>
-          <w:rFonts w:ascii="Courier" w:eastAsiaTheme="minorHAnsi" w:hAnsi="Courier" w:cs="Times New Roman"/>
-          <w:sz w:val="18"/>
-          <w:szCs w:val="18"/>
-          <w:lang w:val="es-AR" w:eastAsia="en-US"/>
-        </w:rPr>
-      </w:pPr>
-      <w:r>
-        <w:rPr>
-          <w:rFonts w:ascii="Courier" w:eastAsiaTheme="minorHAnsi" w:hAnsi="Courier" w:cs="Times New Roman"/>
-          <w:sz w:val="18"/>
-          <w:szCs w:val="18"/>
-          <w:lang w:val="es-AR" w:eastAsia="en-US"/>
-        </w:rPr>
-        <w:t>federiccastro@alumno.unlam.edu.ar</w:t>
-      </w:r>
-    </w:p>
-    <w:p>
-      <w:pPr>
-        <w:pStyle w:val="Textoindependiente"/>
-        <w:jc w:val="right"/>
-        <w:rPr>
-          <w:b/>
-          <w:bCs/>
-          <w:lang w:val="es-AR"/>
-        </w:rPr>
-      </w:pPr>
-    </w:p>
-    <w:p>
-      <w:pPr>
-        <w:pStyle w:val="Textoindependiente"/>
-        <w:jc w:val="right"/>
-        <w:rPr>
-          <w:b/>
-          <w:bCs/>
-          <w:lang w:val="es-AR"/>
-        </w:rPr>
-      </w:pPr>
-    </w:p>
-    <w:p>
-      <w:pPr>
-        <w:pStyle w:val="Textoindependiente"/>
-        <w:jc w:val="right"/>
-        <w:rPr>
-          <w:lang w:val="es-AR"/>
-        </w:rPr>
-      </w:pPr>
-      <w:r>
-        <w:rPr>
-          <w:b/>
-          <w:bCs/>
-          <w:lang w:val="es-AR"/>
-        </w:rPr>
-        <w:t>Referente Institucional:</w:t>
-      </w:r>
-    </w:p>
-    <w:p>
-      <w:pPr>
-        <w:pStyle w:val="Textoindependiente"/>
-        <w:jc w:val="right"/>
-        <w:rPr>
-          <w:lang w:val="es-AR"/>
-        </w:rPr>
-      </w:pPr>
-      <w:r>
-        <w:rPr>
-          <w:lang w:val="es-AR"/>
-        </w:rPr>
-        <w:t>Carla, BARROS</w:t>
-      </w:r>
-    </w:p>
-    <w:p>
-      <w:pPr>
-        <w:pStyle w:val="Textoindependiente"/>
-        <w:jc w:val="right"/>
-        <w:rPr>
-          <w:lang w:val="es-AR"/>
-        </w:rPr>
-      </w:pPr>
-      <w:r>
-        <w:rPr>
-          <w:lang w:val="es-AR"/>
-        </w:rPr>
-        <w:t xml:space="preserve">Mónica, LORDI </w:t>
-      </w:r>
-    </w:p>
-    <w:p>
-      <w:pPr>
-        <w:pStyle w:val="Textoindependiente"/>
-        <w:jc w:val="right"/>
-        <w:rPr>
-          <w:lang w:val="es-AR"/>
-        </w:rPr>
-      </w:pPr>
-      <w:r>
-        <w:rPr>
-          <w:lang w:val="es-AR"/>
-        </w:rPr>
-        <w:t>Jorge Alejandro, SILVESTRI</w:t>
-      </w:r>
-    </w:p>
-    <w:p>
-      <w:pPr>
-        <w:pStyle w:val="Textoindependiente"/>
-        <w:jc w:val="right"/>
-        <w:rPr>
-          <w:lang w:val="es-AR"/>
-        </w:rPr>
-      </w:pPr>
-      <w:r>
-        <w:rPr>
-          <w:lang w:val="es-AR"/>
-        </w:rPr>
-        <w:t xml:space="preserve">Alesio Esteban Abell, SINOPOLI </w:t>
-      </w:r>
-    </w:p>
-    <w:p>
-      <w:pPr>
-        <w:pStyle w:val="Textoindependiente"/>
-        <w:jc w:val="right"/>
-        <w:rPr>
-          <w:lang w:val="es-AR"/>
-        </w:rPr>
-      </w:pPr>
-      <w:r>
-        <w:rPr>
-          <w:lang w:val="es-AR"/>
-        </w:rPr>
-        <w:t>Martín Hernan, ZEBALLOS</w:t>
-      </w:r>
-    </w:p>
-    <w:p>
-      <w:pPr>
-        <w:pStyle w:val="Textoindependiente"/>
-        <w:jc w:val="right"/>
-        <w:rPr>
-          <w:lang w:val="es-AR"/>
-        </w:rPr>
-      </w:pPr>
-      <w:r>
-        <w:rPr>
-          <w:lang w:val="es-AR"/>
-        </w:rPr>
-        <w:t>Universidad Nacional de la Matanza</w:t>
-      </w:r>
-    </w:p>
-    <w:p>
-      <w:pPr>
-        <w:rPr>
-          <w:lang w:val="es-AR"/>
-        </w:rPr>
-      </w:pPr>
+    <w:tbl>
+      <w:tblPr>
+        <w:tblW w:w="9000" w:type="dxa"/>
+        <w:tblLook w:val="04A0" w:firstRow="1" w:lastRow="0" w:firstColumn="1" w:lastColumn="0" w:noHBand="0" w:noVBand="1"/>
+      </w:tblPr>
+      <w:tblGrid>
+        <w:gridCol w:w="5200"/>
+        <w:gridCol w:w="3800"/>
+      </w:tblGrid>
+      <w:tr>
+        <w:tc>
+          <w:tcPr>
+            <w:tcW w:w="5200" w:type="dxa"/>
+          </w:tcPr>
+          <w:p>
+            <w:pPr>
+              <w:pStyle w:val="Textoindependiente"/>
+              <w:jc w:val="left"/>
+              <w:rPr>
+                <w:sz w:val="24"/>
+                <w:lang w:val="es-AR"/>
+              </w:rPr>
+            </w:pPr>
+            <w:r>
+              <w:rPr>
+                <w:b/>
+                <w:bCs/>
+                <w:sz w:val="24"/>
+                <w:lang w:val="es-AR"/>
+              </w:rPr>
+              <w:t>Integrantes:</w:t>
+            </w:r>
+          </w:p>
+          <w:p>
+            <w:pPr>
+              <w:pStyle w:val="Textoindependiente"/>
+              <w:jc w:val="left"/>
+              <w:rPr>
+                <w:lang w:val="es-AR"/>
+              </w:rPr>
+            </w:pPr>
+            <w:r>
+              <w:rPr>
+                <w:lang w:val="es-AR"/>
+              </w:rPr>
+              <w:t>Nicolás Agustín Marco</w:t>
+            </w:r>
+          </w:p>
+          <w:p>
+            <w:pPr>
+              <w:pStyle w:val="Textoindependiente"/>
+              <w:jc w:val="left"/>
+              <w:rPr>
+                <w:rFonts w:ascii="Courier" w:eastAsiaTheme="minorHAnsi" w:hAnsi="Courier" w:cs="Times New Roman"/>
+                <w:sz w:val="18"/>
+                <w:szCs w:val="18"/>
+                <w:lang w:val="es-AR" w:eastAsia="en-US"/>
+              </w:rPr>
+            </w:pPr>
+            <w:r>
+              <w:rPr>
+                <w:rFonts w:ascii="Courier" w:eastAsiaTheme="minorHAnsi" w:hAnsi="Courier" w:cs="Times New Roman"/>
+                <w:sz w:val="18"/>
+                <w:szCs w:val="18"/>
+                <w:lang w:val="es-AR" w:eastAsia="en-US"/>
+              </w:rPr>
+              <w:t>nmarco@alumno.unlam.edu.ar</w:t>
+            </w:r>
+          </w:p>
+          <w:p>
+            <w:pPr>
+              <w:pStyle w:val="Textoindependiente"/>
+              <w:jc w:val="left"/>
+              <w:rPr>
+                <w:lang w:val="es-AR"/>
+              </w:rPr>
+            </w:pPr>
+            <w:r>
+              <w:rPr>
+                <w:lang w:val="es-AR"/>
+              </w:rPr>
+              <w:t>Iván</w:t>
+            </w:r>
+            <w:r>
+              <w:rPr>
+                <w:lang w:val="es-AR"/>
+              </w:rPr>
+              <w:t xml:space="preserve"> </w:t>
+            </w:r>
+            <w:proofErr w:type="spellStart"/>
+            <w:r>
+              <w:rPr>
+                <w:lang w:val="es-AR"/>
+              </w:rPr>
+              <w:t>Fabrizio</w:t>
+            </w:r>
+            <w:proofErr w:type="spellEnd"/>
+            <w:r>
+              <w:rPr>
+                <w:lang w:val="es-AR"/>
+              </w:rPr>
+              <w:t xml:space="preserve"> </w:t>
+            </w:r>
+            <w:proofErr w:type="spellStart"/>
+            <w:r>
+              <w:rPr>
+                <w:lang w:val="es-AR"/>
+              </w:rPr>
+              <w:t>Abaca</w:t>
+            </w:r>
+            <w:proofErr w:type="spellEnd"/>
+          </w:p>
+          <w:p>
+            <w:pPr>
+              <w:pStyle w:val="Textoindependiente"/>
+              <w:jc w:val="left"/>
+              <w:rPr>
+                <w:rFonts w:ascii="Courier" w:eastAsiaTheme="minorHAnsi" w:hAnsi="Courier" w:cs="Times New Roman"/>
+                <w:sz w:val="18"/>
+                <w:szCs w:val="18"/>
+                <w:lang w:val="es-AR" w:eastAsia="en-US"/>
+              </w:rPr>
+            </w:pPr>
+            <w:r>
+              <w:rPr>
+                <w:rFonts w:ascii="Courier" w:eastAsiaTheme="minorHAnsi" w:hAnsi="Courier" w:cs="Times New Roman"/>
+                <w:sz w:val="18"/>
+                <w:szCs w:val="18"/>
+                <w:lang w:val="es-AR" w:eastAsia="en-US"/>
+              </w:rPr>
+              <w:t>iabaca@alumno.unlam.edu.ar</w:t>
+            </w:r>
+          </w:p>
+          <w:p>
+            <w:pPr>
+              <w:pStyle w:val="Textoindependiente"/>
+              <w:jc w:val="left"/>
+              <w:rPr>
+                <w:lang w:val="es-AR"/>
+              </w:rPr>
+            </w:pPr>
+            <w:r>
+              <w:rPr>
+                <w:lang w:val="es-AR"/>
+              </w:rPr>
+              <w:t xml:space="preserve">Florencia </w:t>
+            </w:r>
+            <w:r>
+              <w:rPr>
+                <w:lang w:val="es-AR"/>
+              </w:rPr>
+              <w:t xml:space="preserve">Berenice </w:t>
+            </w:r>
+            <w:proofErr w:type="spellStart"/>
+            <w:r>
+              <w:rPr>
+                <w:lang w:val="es-AR"/>
+              </w:rPr>
+              <w:t>Licarzi</w:t>
+            </w:r>
+            <w:proofErr w:type="spellEnd"/>
+          </w:p>
+          <w:p>
+            <w:pPr>
+              <w:pStyle w:val="Textoindependiente"/>
+              <w:jc w:val="left"/>
+              <w:rPr>
+                <w:rFonts w:ascii="Courier" w:eastAsiaTheme="minorHAnsi" w:hAnsi="Courier" w:cs="Times New Roman"/>
+                <w:sz w:val="18"/>
+                <w:szCs w:val="18"/>
+                <w:lang w:val="es-AR" w:eastAsia="en-US"/>
+              </w:rPr>
+            </w:pPr>
+            <w:r>
+              <w:rPr>
+                <w:rFonts w:ascii="Courier" w:eastAsiaTheme="minorHAnsi" w:hAnsi="Courier" w:cs="Times New Roman"/>
+                <w:sz w:val="18"/>
+                <w:szCs w:val="18"/>
+                <w:lang w:val="es-AR" w:eastAsia="en-US"/>
+              </w:rPr>
+              <w:t>flicarzi@alumno.unlam.edu.ar</w:t>
+            </w:r>
+          </w:p>
+          <w:p>
+            <w:pPr>
+              <w:pStyle w:val="Textoindependiente"/>
+              <w:jc w:val="left"/>
+              <w:rPr>
+                <w:lang w:val="es-AR"/>
+              </w:rPr>
+            </w:pPr>
+            <w:r>
+              <w:rPr>
+                <w:lang w:val="es-AR"/>
+              </w:rPr>
+              <w:t>Luca</w:t>
+            </w:r>
+            <w:r>
+              <w:rPr>
+                <w:lang w:val="es-AR"/>
+              </w:rPr>
+              <w:t xml:space="preserve"> </w:t>
+            </w:r>
+            <w:proofErr w:type="spellStart"/>
+            <w:r>
+              <w:rPr>
+                <w:lang w:val="es-AR"/>
+              </w:rPr>
+              <w:t>Sebastian</w:t>
+            </w:r>
+            <w:proofErr w:type="spellEnd"/>
+            <w:r>
+              <w:rPr>
+                <w:lang w:val="es-AR"/>
+              </w:rPr>
+              <w:t xml:space="preserve"> </w:t>
+            </w:r>
+            <w:proofErr w:type="spellStart"/>
+            <w:r>
+              <w:rPr>
+                <w:lang w:val="es-AR"/>
+              </w:rPr>
+              <w:t>Gonzalez</w:t>
+            </w:r>
+            <w:proofErr w:type="spellEnd"/>
+          </w:p>
+          <w:p>
+            <w:pPr>
+              <w:pStyle w:val="Textoindependiente"/>
+              <w:jc w:val="left"/>
+              <w:rPr>
+                <w:rFonts w:ascii="Courier" w:eastAsiaTheme="minorHAnsi" w:hAnsi="Courier" w:cs="Times New Roman"/>
+                <w:sz w:val="18"/>
+                <w:szCs w:val="18"/>
+                <w:lang w:val="es-AR" w:eastAsia="en-US"/>
+              </w:rPr>
+            </w:pPr>
+            <w:r>
+              <w:rPr>
+                <w:rFonts w:ascii="Courier" w:eastAsiaTheme="minorHAnsi" w:hAnsi="Courier" w:cs="Times New Roman"/>
+                <w:sz w:val="18"/>
+                <w:szCs w:val="18"/>
+                <w:lang w:val="es-AR" w:eastAsia="en-US"/>
+              </w:rPr>
+              <w:t>lucasebgonzalez@alumno.unlam.edu.ar</w:t>
+            </w:r>
+          </w:p>
+          <w:p>
+            <w:pPr>
+              <w:pStyle w:val="Textoindependiente"/>
+              <w:jc w:val="left"/>
+            </w:pPr>
+            <w:r>
+              <w:t xml:space="preserve">Augusto Martin </w:t>
+            </w:r>
+            <w:proofErr w:type="spellStart"/>
+            <w:r>
+              <w:t>Coronati</w:t>
+            </w:r>
+            <w:proofErr w:type="spellEnd"/>
+          </w:p>
+          <w:p>
+            <w:pPr>
+              <w:pStyle w:val="Textoindependiente"/>
+              <w:jc w:val="left"/>
+              <w:rPr>
+                <w:rFonts w:ascii="Courier" w:eastAsiaTheme="minorHAnsi" w:hAnsi="Courier" w:cs="Times New Roman"/>
+                <w:sz w:val="18"/>
+                <w:szCs w:val="18"/>
+                <w:lang w:eastAsia="en-US"/>
+              </w:rPr>
+            </w:pPr>
+            <w:r>
+              <w:rPr>
+                <w:rFonts w:ascii="Courier" w:eastAsiaTheme="minorHAnsi" w:hAnsi="Courier" w:cs="Times New Roman"/>
+                <w:sz w:val="18"/>
+                <w:szCs w:val="18"/>
+                <w:lang w:eastAsia="en-US"/>
+              </w:rPr>
+              <w:t>acoronati@alumno.unlam.edu.ar</w:t>
+            </w:r>
+          </w:p>
+          <w:p>
+            <w:pPr>
+              <w:pStyle w:val="Textoindependiente"/>
+              <w:jc w:val="left"/>
+              <w:rPr>
+                <w:lang w:val="es-AR"/>
+              </w:rPr>
+            </w:pPr>
+            <w:r>
+              <w:rPr>
+                <w:lang w:val="es-AR"/>
+              </w:rPr>
+              <w:t xml:space="preserve">Franco </w:t>
+            </w:r>
+            <w:proofErr w:type="spellStart"/>
+            <w:r>
+              <w:rPr>
+                <w:lang w:val="es-AR"/>
+              </w:rPr>
+              <w:t>Caccavari</w:t>
+            </w:r>
+            <w:proofErr w:type="spellEnd"/>
+          </w:p>
+          <w:p>
+            <w:pPr>
+              <w:pStyle w:val="Textoindependiente"/>
+              <w:jc w:val="left"/>
+              <w:rPr>
+                <w:rFonts w:ascii="Courier" w:eastAsiaTheme="minorHAnsi" w:hAnsi="Courier" w:cs="Times New Roman"/>
+                <w:sz w:val="18"/>
+                <w:szCs w:val="18"/>
+                <w:lang w:val="es-AR" w:eastAsia="en-US"/>
+              </w:rPr>
+            </w:pPr>
+            <w:r>
+              <w:rPr>
+                <w:rFonts w:ascii="Courier" w:eastAsiaTheme="minorHAnsi" w:hAnsi="Courier" w:cs="Times New Roman"/>
+                <w:sz w:val="18"/>
+                <w:szCs w:val="18"/>
+                <w:lang w:val="es-AR" w:eastAsia="en-US"/>
+              </w:rPr>
+              <w:t>fcaccavari064@alumno.unlam.edu.ar</w:t>
+            </w:r>
+          </w:p>
+          <w:p>
+            <w:pPr>
+              <w:pStyle w:val="Textoindependiente"/>
+              <w:jc w:val="left"/>
+              <w:rPr>
+                <w:lang w:val="es-AR"/>
+              </w:rPr>
+            </w:pPr>
+            <w:r>
+              <w:rPr>
+                <w:lang w:val="es-AR"/>
+              </w:rPr>
+              <w:t xml:space="preserve">Lautaro </w:t>
+            </w:r>
+            <w:r>
+              <w:rPr>
+                <w:lang w:val="es-AR"/>
+              </w:rPr>
+              <w:t xml:space="preserve">Leonardo Nicolas </w:t>
+            </w:r>
+            <w:r>
+              <w:rPr>
+                <w:lang w:val="es-AR"/>
+              </w:rPr>
+              <w:t>Schiaffino</w:t>
+            </w:r>
+          </w:p>
+          <w:p>
+            <w:pPr>
+              <w:pStyle w:val="Textoindependiente"/>
+              <w:jc w:val="left"/>
+              <w:rPr>
+                <w:rFonts w:ascii="Courier" w:eastAsiaTheme="minorHAnsi" w:hAnsi="Courier" w:cs="Times New Roman"/>
+                <w:sz w:val="18"/>
+                <w:szCs w:val="18"/>
+                <w:lang w:val="es-AR" w:eastAsia="en-US"/>
+              </w:rPr>
+            </w:pPr>
+            <w:r>
+              <w:rPr>
+                <w:rFonts w:ascii="Courier" w:eastAsiaTheme="minorHAnsi" w:hAnsi="Courier" w:cs="Times New Roman"/>
+                <w:sz w:val="18"/>
+                <w:szCs w:val="18"/>
+                <w:lang w:val="es-AR" w:eastAsia="en-US"/>
+              </w:rPr>
+              <w:t>laschiaffino@alumno.unlam.edu.ar</w:t>
+            </w:r>
+          </w:p>
+          <w:p>
+            <w:pPr>
+              <w:pStyle w:val="Textoindependiente"/>
+              <w:jc w:val="left"/>
+              <w:rPr>
+                <w:lang w:val="es-AR"/>
+              </w:rPr>
+            </w:pPr>
+            <w:r>
+              <w:rPr>
+                <w:lang w:val="es-AR"/>
+              </w:rPr>
+              <w:t xml:space="preserve">Federico </w:t>
+            </w:r>
+            <w:r>
+              <w:rPr>
+                <w:lang w:val="es-AR"/>
+              </w:rPr>
+              <w:t xml:space="preserve">Gabriel </w:t>
+            </w:r>
+            <w:r>
+              <w:rPr>
+                <w:lang w:val="es-AR"/>
+              </w:rPr>
+              <w:t>Castro</w:t>
+            </w:r>
+          </w:p>
+          <w:p>
+            <w:pPr>
+              <w:pStyle w:val="Textoindependiente"/>
+              <w:jc w:val="left"/>
+              <w:rPr>
+                <w:rFonts w:ascii="Courier" w:eastAsiaTheme="minorHAnsi" w:hAnsi="Courier" w:cs="Times New Roman"/>
+                <w:sz w:val="18"/>
+                <w:szCs w:val="18"/>
+                <w:lang w:val="es-AR" w:eastAsia="en-US"/>
+              </w:rPr>
+            </w:pPr>
+            <w:r>
+              <w:rPr>
+                <w:rFonts w:ascii="Courier" w:eastAsiaTheme="minorHAnsi" w:hAnsi="Courier" w:cs="Times New Roman"/>
+                <w:sz w:val="18"/>
+                <w:szCs w:val="18"/>
+                <w:lang w:val="es-AR" w:eastAsia="en-US"/>
+              </w:rPr>
+              <w:t>federiccastro@alumno.unlam.edu.ar</w:t>
+            </w:r>
+            <w:bookmarkStart w:id="1" w:name="_GoBack"/>
+            <w:bookmarkEnd w:id="1"/>
+          </w:p>
+        </w:tc>
+        <w:tc>
+          <w:tcPr>
+            <w:tcW w:w="3800" w:type="dxa"/>
+          </w:tcPr>
+          <w:p>
+            <w:pPr>
+              <w:pStyle w:val="Textoindependiente"/>
+              <w:jc w:val="right"/>
+              <w:rPr>
+                <w:lang w:val="es-AR"/>
+              </w:rPr>
+            </w:pPr>
+            <w:r>
+              <w:rPr>
+                <w:b/>
+                <w:bCs/>
+                <w:lang w:val="es-AR"/>
+              </w:rPr>
+              <w:t>Referente</w:t>
+            </w:r>
+            <w:r>
+              <w:rPr>
+                <w:b/>
+                <w:bCs/>
+                <w:lang w:val="es-AR"/>
+              </w:rPr>
+              <w:t>s</w:t>
+            </w:r>
+            <w:r>
+              <w:rPr>
+                <w:b/>
+                <w:bCs/>
+                <w:lang w:val="es-AR"/>
+              </w:rPr>
+              <w:t xml:space="preserve"> Institucional</w:t>
+            </w:r>
+            <w:r>
+              <w:rPr>
+                <w:b/>
+                <w:bCs/>
+                <w:lang w:val="es-AR"/>
+              </w:rPr>
+              <w:t>es</w:t>
+            </w:r>
+            <w:r>
+              <w:rPr>
+                <w:b/>
+                <w:bCs/>
+                <w:lang w:val="es-AR"/>
+              </w:rPr>
+              <w:t>:</w:t>
+            </w:r>
+          </w:p>
+          <w:p>
+            <w:pPr>
+              <w:pStyle w:val="Textoindependiente"/>
+              <w:jc w:val="right"/>
+              <w:rPr>
+                <w:lang w:val="es-AR"/>
+              </w:rPr>
+            </w:pPr>
+            <w:r>
+              <w:rPr>
+                <w:lang w:val="es-AR"/>
+              </w:rPr>
+              <w:t>Carla, BARROS</w:t>
+            </w:r>
+          </w:p>
+          <w:p>
+            <w:pPr>
+              <w:pStyle w:val="Textoindependiente"/>
+              <w:jc w:val="right"/>
+              <w:rPr>
+                <w:lang w:val="es-AR"/>
+              </w:rPr>
+            </w:pPr>
+            <w:r>
+              <w:rPr>
+                <w:lang w:val="es-AR"/>
+              </w:rPr>
+              <w:t xml:space="preserve">Mónica, LORDI </w:t>
+            </w:r>
+          </w:p>
+          <w:p>
+            <w:pPr>
+              <w:pStyle w:val="Textoindependiente"/>
+              <w:jc w:val="right"/>
+              <w:rPr>
+                <w:lang w:val="es-AR"/>
+              </w:rPr>
+            </w:pPr>
+            <w:r>
+              <w:rPr>
+                <w:lang w:val="es-AR"/>
+              </w:rPr>
+              <w:t>Jorge Alejandro, SILVESTRI</w:t>
+            </w:r>
+          </w:p>
+          <w:p>
+            <w:pPr>
+              <w:pStyle w:val="Textoindependiente"/>
+              <w:jc w:val="right"/>
+              <w:rPr>
+                <w:lang w:val="es-AR"/>
+              </w:rPr>
+            </w:pPr>
+            <w:proofErr w:type="spellStart"/>
+            <w:r>
+              <w:rPr>
+                <w:lang w:val="es-AR"/>
+              </w:rPr>
+              <w:t>Alesio</w:t>
+            </w:r>
+            <w:proofErr w:type="spellEnd"/>
+            <w:r>
+              <w:rPr>
+                <w:lang w:val="es-AR"/>
+              </w:rPr>
+              <w:t xml:space="preserve"> Esteban Abell, SINOPOLI </w:t>
+            </w:r>
+          </w:p>
+          <w:p>
+            <w:pPr>
+              <w:pStyle w:val="Textoindependiente"/>
+              <w:jc w:val="right"/>
+              <w:rPr>
+                <w:lang w:val="es-AR"/>
+              </w:rPr>
+            </w:pPr>
+            <w:r>
+              <w:rPr>
+                <w:lang w:val="es-AR"/>
+              </w:rPr>
+              <w:t xml:space="preserve">Martín </w:t>
+            </w:r>
+            <w:proofErr w:type="spellStart"/>
+            <w:r>
+              <w:rPr>
+                <w:lang w:val="es-AR"/>
+              </w:rPr>
+              <w:t>Hernan</w:t>
+            </w:r>
+            <w:proofErr w:type="spellEnd"/>
+            <w:r>
+              <w:rPr>
+                <w:lang w:val="es-AR"/>
+              </w:rPr>
+              <w:t>, ZEBALLOS</w:t>
+            </w:r>
+          </w:p>
+          <w:p>
+            <w:pPr>
+              <w:pStyle w:val="Textoindependiente"/>
+              <w:jc w:val="right"/>
+              <w:rPr>
+                <w:lang w:val="es-AR"/>
+              </w:rPr>
+            </w:pPr>
+            <w:r>
+              <w:rPr>
+                <w:lang w:val="es-AR"/>
+              </w:rPr>
+              <w:t>Universidad Nacional de la Matanza</w:t>
+            </w:r>
+          </w:p>
+        </w:tc>
+      </w:tr>
+    </w:tbl>
+    <w:p>
+      <w:pPr>
+        <w:rPr>
+          <w:lang w:val="es-AR"/>
+        </w:rPr>
+      </w:pPr>
+    </w:p>
+    <w:p>
+      <w:pPr>
+        <w:rPr>
+          <w:lang w:val="es-AR"/>
+        </w:rPr>
+      </w:pPr>
+      <w:bookmarkStart w:id="2" w:name="carátula"/>
     </w:p>
     <w:p>
       <w:pPr>
@@ -799,8 +700,8 @@
           <w:lang w:val="es-AR"/>
         </w:rPr>
       </w:pPr>
-      <w:bookmarkStart w:id="2" w:name="resumen"/>
-      <w:bookmarkEnd w:id="1"/>
+      <w:bookmarkStart w:id="3" w:name="resumen"/>
+      <w:bookmarkEnd w:id="2"/>
       <w:r>
         <w:rPr>
           <w:lang w:val="es-AR"/>
@@ -904,8 +805,8 @@
           <w:sz w:val="24"/>
         </w:rPr>
       </w:pPr>
-      <w:bookmarkStart w:id="3" w:name="abstract"/>
-      <w:bookmarkEnd w:id="2"/>
+      <w:bookmarkStart w:id="4" w:name="abstract"/>
+      <w:bookmarkEnd w:id="3"/>
       <w:r>
         <w:rPr>
           <w:b/>
@@ -1019,8 +920,8 @@
           <w:lang w:val="es-AR"/>
         </w:rPr>
       </w:pPr>
-      <w:bookmarkStart w:id="4" w:name="i.-contexto"/>
-      <w:bookmarkEnd w:id="3"/>
+      <w:bookmarkStart w:id="5" w:name="i.-contexto"/>
+      <w:bookmarkEnd w:id="4"/>
       <w:r>
         <w:rPr>
           <w:b/>
@@ -1083,8 +984,8 @@
           <w:lang w:val="es-AR"/>
         </w:rPr>
       </w:pPr>
-      <w:bookmarkStart w:id="5" w:name="ii.-introducción"/>
-      <w:bookmarkEnd w:id="4"/>
+      <w:bookmarkStart w:id="6" w:name="ii.-introducción"/>
+      <w:bookmarkEnd w:id="5"/>
       <w:r>
         <w:rPr>
           <w:b/>
@@ -1111,7 +1012,7 @@
           <w:lang w:val="es-AR"/>
         </w:rPr>
       </w:pPr>
-      <w:bookmarkStart w:id="6" w:name="a.-el-problema"/>
+      <w:bookmarkStart w:id="7" w:name="a.-el-problema"/>
       <w:r>
         <w:rPr>
           <w:b/>
@@ -1193,8 +1094,8 @@
           <w:lang w:val="es-AR"/>
         </w:rPr>
       </w:pPr>
-      <w:bookmarkStart w:id="7" w:name="b.-antecedentes-y-origen"/>
-      <w:bookmarkEnd w:id="6"/>
+      <w:bookmarkStart w:id="8" w:name="b.-antecedentes-y-origen"/>
+      <w:bookmarkEnd w:id="7"/>
       <w:r>
         <w:rPr>
           <w:b/>
@@ -1522,8 +1423,8 @@
           <w:lang w:val="es-AR"/>
         </w:rPr>
       </w:pPr>
-      <w:bookmarkStart w:id="8" w:name="c.-propiedades-y-estructura"/>
-      <w:bookmarkEnd w:id="7"/>
+      <w:bookmarkStart w:id="9" w:name="c.-propiedades-y-estructura"/>
+      <w:bookmarkEnd w:id="8"/>
       <w:r>
         <w:rPr>
           <w:b/>
@@ -1844,8 +1745,8 @@
           <w:lang w:val="es-AR"/>
         </w:rPr>
       </w:pPr>
-      <w:bookmarkStart w:id="9" w:name="d.-ámbito-de-aplicabilidad"/>
-      <w:bookmarkEnd w:id="8"/>
+      <w:bookmarkStart w:id="10" w:name="d.-ámbito-de-aplicabilidad"/>
+      <w:bookmarkEnd w:id="9"/>
       <w:r>
         <w:rPr>
           <w:b/>
@@ -2106,9 +2007,9 @@
         </w:rPr>
         <w:t>) requieren condiciones que no se dan en implementaciones reales [8].</w:t>
       </w:r>
-      <w:bookmarkStart w:id="10" w:name="iii.-métodos"/>
-      <w:bookmarkEnd w:id="5"/>
-      <w:bookmarkEnd w:id="9"/>
+      <w:bookmarkStart w:id="11" w:name="iii.-métodos"/>
+      <w:bookmarkEnd w:id="6"/>
+      <w:bookmarkEnd w:id="10"/>
     </w:p>
     <w:p>
       <w:pPr>
@@ -2173,7 +2074,7 @@
           <w:lang w:val="es-AR"/>
         </w:rPr>
       </w:pPr>
-      <w:bookmarkStart w:id="11" w:name="a.-diseño"/>
+      <w:bookmarkStart w:id="12" w:name="a.-diseño"/>
       <w:r>
         <w:rPr>
           <w:b/>
@@ -2371,8 +2272,8 @@
           <w:lang w:val="es-AR"/>
         </w:rPr>
       </w:pPr>
-      <w:bookmarkStart w:id="12" w:name="b.-implementación-matemática"/>
-      <w:bookmarkEnd w:id="11"/>
+      <w:bookmarkStart w:id="13" w:name="b.-implementación-matemática"/>
+      <w:bookmarkEnd w:id="12"/>
       <w:r>
         <w:rPr>
           <w:b/>
@@ -2695,8 +2596,8 @@
         </w:rPr>
         <w:t>: para los modos ECB y CBC, los mensajes se completan al múltiplo de 16 bytes más cercano usando PKCS#7 (se añaden N bytes de valor N).</w:t>
       </w:r>
-      <w:bookmarkStart w:id="13" w:name="c.-estructura-del-código"/>
-      <w:bookmarkEnd w:id="12"/>
+      <w:bookmarkStart w:id="14" w:name="c.-estructura-del-código"/>
+      <w:bookmarkEnd w:id="13"/>
     </w:p>
     <w:p>
       <w:pPr>
@@ -2936,8 +2837,8 @@
           <w:lang w:val="es-AR"/>
         </w:rPr>
       </w:pPr>
-      <w:bookmarkStart w:id="14" w:name="d.-herramientas-utilizadas"/>
-      <w:bookmarkEnd w:id="13"/>
+      <w:bookmarkStart w:id="15" w:name="d.-herramientas-utilizadas"/>
+      <w:bookmarkEnd w:id="14"/>
       <w:r>
         <w:rPr>
           <w:b/>
@@ -3012,9 +2913,9 @@
         </w:rPr>
         <w:t>Vectores de prueba oficiales del NIST (FIPS-197) para validación de corrección.</w:t>
       </w:r>
-      <w:bookmarkStart w:id="15" w:name="iv.-resultados-y-objetivos"/>
-      <w:bookmarkEnd w:id="10"/>
-      <w:bookmarkEnd w:id="14"/>
+      <w:bookmarkStart w:id="16" w:name="iv.-resultados-y-objetivos"/>
+      <w:bookmarkEnd w:id="11"/>
+      <w:bookmarkEnd w:id="15"/>
     </w:p>
     <w:p>
       <w:pPr>
@@ -3062,7 +2963,7 @@
           <w:lang w:val="es-AR"/>
         </w:rPr>
       </w:pPr>
-      <w:bookmarkStart w:id="16" w:name="Xb9913b4c11c41866c1a089365dcee8b906748a3"/>
+      <w:bookmarkStart w:id="17" w:name="Xb9913b4c11c41866c1a089365dcee8b906748a3"/>
       <w:r>
         <w:rPr>
           <w:b/>
@@ -3616,8 +3517,8 @@
           <w:lang w:val="es-AR"/>
         </w:rPr>
       </w:pPr>
-      <w:bookmarkStart w:id="17" w:name="X9bc276a8e26c458b9326036ea8bb9bd4d18758a"/>
-      <w:bookmarkEnd w:id="16"/>
+      <w:bookmarkStart w:id="18" w:name="X9bc276a8e26c458b9326036ea8bb9bd4d18758a"/>
+      <w:bookmarkEnd w:id="17"/>
       <w:r>
         <w:rPr>
           <w:b/>
@@ -4289,7 +4190,6 @@
         <w:rPr>
           <w:noProof/>
         </w:rPr>
-        <w:lastRenderedPageBreak/>
         <w:drawing>
           <wp:inline distT="0" distB="0" distL="0" distR="0" wp14:anchorId="7A366993" wp14:editId="41501F1A">
             <wp:extent cx="1219200" cy="1219200"/>
@@ -4435,8 +4335,8 @@
           <w:lang w:val="es-AR"/>
         </w:rPr>
       </w:pPr>
-      <w:bookmarkStart w:id="18" w:name="c.-mejoras-futuras"/>
-      <w:bookmarkEnd w:id="17"/>
+      <w:bookmarkStart w:id="19" w:name="c.-mejoras-futuras"/>
+      <w:bookmarkEnd w:id="18"/>
     </w:p>
     <w:p>
       <w:pPr>
@@ -4672,9 +4572,9 @@
           <w:lang w:val="es-AR"/>
         </w:rPr>
       </w:pPr>
-      <w:bookmarkStart w:id="19" w:name="v.-conclusiones"/>
-      <w:bookmarkEnd w:id="15"/>
-      <w:bookmarkEnd w:id="18"/>
+      <w:bookmarkStart w:id="20" w:name="v.-conclusiones"/>
+      <w:bookmarkEnd w:id="16"/>
+      <w:bookmarkEnd w:id="19"/>
       <w:r>
         <w:rPr>
           <w:b/>
@@ -4826,39 +4726,31 @@
         <w:rPr>
           <w:lang w:val="es-AR"/>
         </w:rPr>
-        <w:t>SubByte</w:t>
-      </w:r>
-      <w:bookmarkStart w:id="20" w:name="_GoBack"/>
+        <w:t>SubBytes</w:t>
+      </w:r>
+      <w:proofErr w:type="spellEnd"/>
+      <w:r>
+        <w:rPr>
+          <w:lang w:val="es-AR"/>
+        </w:rPr>
+        <w:t>, construida a partir de la inversa multiplicativa en GF(2⁸) compuesta con una transformación afín, es la única transformación no lineal del cifrador y la fuente de la confusión. Ambos conceptos fueron formulados por Shannon en 1949 [6] y AES constituye uno de los ejemplos más estudiados y rigurosos de su aplicación práctica.</w:t>
+      </w:r>
+    </w:p>
+    <w:p>
+      <w:pPr>
+        <w:pStyle w:val="Textoindependiente"/>
+        <w:rPr>
+          <w:lang w:val="es-AR"/>
+        </w:rPr>
+      </w:pPr>
+      <w:r>
+        <w:rPr>
+          <w:lang w:val="es-AR"/>
+        </w:rPr>
+        <w:t>La disponibilidad pública del estándar FIPS-197, con sus vectores de prueba detallados ronda por ronda, fue en este trabajo tanto una herramienta de validación como una demostración del principio de seguridad por diseño abierto: la confianza en AES no descansa en el secreto de su diseño, sino en décadas de escrutinio criptográfico sin que se haya encontrado ningún ataque práctico en condiciones normales de uso [8].</w:t>
+      </w:r>
+      <w:bookmarkStart w:id="21" w:name="vi.-referencias-y-bibliografía"/>
       <w:bookmarkEnd w:id="20"/>
-      <w:r>
-        <w:rPr>
-          <w:lang w:val="es-AR"/>
-        </w:rPr>
-        <w:t>s</w:t>
-      </w:r>
-      <w:proofErr w:type="spellEnd"/>
-      <w:r>
-        <w:rPr>
-          <w:lang w:val="es-AR"/>
-        </w:rPr>
-        <w:t>, construida a partir de la inversa multiplicativa en GF(2⁸) compuesta con una transformación afín, es la única transformación no lineal del cifrador y la fuente de la confusión. Ambos conceptos fueron formulados por Shannon en 1949 [6] y AES constituye uno de los ejemplos más estudiados y rigurosos de su aplicación práctica.</w:t>
-      </w:r>
-    </w:p>
-    <w:p>
-      <w:pPr>
-        <w:pStyle w:val="Textoindependiente"/>
-        <w:rPr>
-          <w:lang w:val="es-AR"/>
-        </w:rPr>
-      </w:pPr>
-      <w:r>
-        <w:rPr>
-          <w:lang w:val="es-AR"/>
-        </w:rPr>
-        <w:t>La disponibilidad pública del estándar FIPS-197, con sus vectores de prueba detallados ronda por ronda, fue en este trabajo tanto una herramienta de validación como una demostración del principio de seguridad por diseño abierto: la confianza en AES no descansa en el secreto de su diseño, sino en décadas de escrutinio criptográfico sin que se haya encontrado ningún ataque práctico en condiciones normales de uso [8].</w:t>
-      </w:r>
-      <w:bookmarkStart w:id="21" w:name="vi.-referencias-y-bibliografía"/>
-      <w:bookmarkEnd w:id="19"/>
     </w:p>
     <w:p>
       <w:pPr>
@@ -7762,7 +7654,7 @@
 </file>
 
 <file path=customXml/itemProps1.xml><?xml version="1.0" encoding="utf-8"?>
-<ds:datastoreItem xmlns:ds="http://schemas.openxmlformats.org/officeDocument/2006/customXml" ds:itemID="{7A0FB30B-711D-4BA1-81A3-A73993740B6B}">
+<ds:datastoreItem xmlns:ds="http://schemas.openxmlformats.org/officeDocument/2006/customXml" ds:itemID="{18ECEAAD-8FAD-486C-B7B6-30D976B269D0}">
   <ds:schemaRefs>
     <ds:schemaRef ds:uri="http://schemas.openxmlformats.org/officeDocument/2006/bibliography"/>
   </ds:schemaRefs>

</xml_diff>